<commit_message>
Revise docs to match DECISIONS.md; add AGENTS.md
Co-Authored-By: Claude Sonnet 5.5 <noreply@anthropic.com>
</commit_message>
<xml_diff>
--- a/video_first_card_room_execution_rules.docx
+++ b/video_first_card_room_execution_rules.docx
@@ -63,6 +63,11 @@
     </w:p>
     <w:p>
       <w:r>
+        <w:t>Authority: DECISIONS.md in this repository resolves open questions and overrides this document where they conflict.</w:t>
+      </w:r>
+    </w:p>
+    <w:p>
+      <w:r>
         <w:t>This document is the execution contract for developers and coding agents. It defines how the product must be designed, implemented, tested, migrated, and deployed. A phase is not complete because code exists. It is complete only when its quality gate passes.</w:t>
       </w:r>
     </w:p>
@@ -71,12 +76,12 @@
         <w:pStyle w:val="Heading1"/>
       </w:pPr>
       <w:r>
-        <w:t>2. Required UI Development Skills</w:t>
+        <w:t>2. UI Development Skills (Optional References)</w:t>
       </w:r>
     </w:p>
     <w:p>
       <w:r>
-        <w:t>Use a design judgment skill before and during frontend work. The preferred combination is:</w:t>
+        <w:t>External design skills are optional references only and are not a dependency. The Project UI Constitution in section 3 is authoritative. If used, a design judgment skill may supplement it:</w:t>
       </w:r>
     </w:p>
     <w:tbl>
@@ -322,7 +327,7 @@
     <w:p/>
     <w:p>
       <w:r>
-        <w:t>Recommended public references: Anthropic's frontend design skill and the UX/UI Design Taste skill. Install only what fits the coding agent being used; do not stack several skills blindly.</w:t>
+        <w:t>Install only what fits the coding agent being used; do not stack several skills blindly. No external skill may override this document.</w:t>
       </w:r>
     </w:p>
     <w:p>
@@ -2692,7 +2697,7 @@
           </w:tcPr>
           <w:p>
             <w:r>
-              <w:t>Fake video grid for 2–8 players, 100dvh room, responsive layout engine, blue cards, pot overlay, action tray, banker mock.</w:t>
+              <w:t>Fake video grid for 2-8 players, 100dvh room, responsive layout engine, blue cards, pot overlay, action tray, banker mock.</w:t>
             </w:r>
           </w:p>
         </w:tc>
@@ -2729,7 +2734,7 @@
           </w:tcPr>
           <w:p>
             <w:r>
-              <w:t>2. Live media</w:t>
+              <w:t>2. Identity + Rooms</w:t>
             </w:r>
           </w:p>
         </w:tc>
@@ -2746,7 +2751,7 @@
           </w:tcPr>
           <w:p>
             <w:r>
-              <w:t>Private rooms, LiveKit/WebRTC integration, camera/mic gate, participant presence, active speaker, reconnect UI.</w:t>
+              <w:t>Guest tokens, invite links, room lifecycle, host controls, spectators.</w:t>
             </w:r>
           </w:p>
         </w:tc>
@@ -2763,7 +2768,7 @@
           </w:tcPr>
           <w:p>
             <w:r>
-              <w:t>6+ synthetic/manual participants can join and media remains stable.</w:t>
+              <w:t>Join, reconnect and kick tests pass.</w:t>
             </w:r>
           </w:p>
         </w:tc>
@@ -2783,7 +2788,7 @@
           </w:tcPr>
           <w:p>
             <w:r>
-              <w:t>3. Shared protocol</w:t>
+              <w:t>3. Database + Ledger</w:t>
             </w:r>
           </w:p>
         </w:tc>
@@ -2801,7 +2806,7 @@
           </w:tcPr>
           <w:p>
             <w:r>
-              <w:t>Versioned room events, connection identity, server state snapshots, reconnect/resync.</w:t>
+              <w:t>Migrations, accounts, immutable transactions, idempotency keys, pot escrow, history.</w:t>
             </w:r>
           </w:p>
         </w:tc>
@@ -2819,7 +2824,7 @@
           </w:tcPr>
           <w:p>
             <w:r>
-              <w:t>Stale and reconnect tests pass before game rules.</w:t>
+              <w:t>Chip conservation and concurrency tests pass.</w:t>
             </w:r>
           </w:p>
         </w:tc>
@@ -2838,7 +2843,116 @@
           </w:tcPr>
           <w:p>
             <w:r>
-              <w:t>4. Card core</w:t>
+              <w:t>4. Live video</w:t>
+            </w:r>
+          </w:p>
+        </w:tc>
+        <w:tc>
+          <w:tcPr>
+            <w:tcW w:type="dxa" w:w="3389"/>
+            <w:tcMar>
+              <w:top w:w="90" w:type="dxa"/>
+              <w:start w:w="90" w:type="dxa"/>
+              <w:bottom w:w="90" w:type="dxa"/>
+              <w:end w:w="90" w:type="dxa"/>
+            </w:tcMar>
+            <w:vAlign w:val="center"/>
+          </w:tcPr>
+          <w:p>
+            <w:r>
+              <w:t>LiveKit/WebRTC, camera/mic gate, presence, active speaker, media failure states.</w:t>
+            </w:r>
+          </w:p>
+        </w:tc>
+        <w:tc>
+          <w:tcPr>
+            <w:tcW w:type="dxa" w:w="3389"/>
+            <w:tcMar>
+              <w:top w:w="90" w:type="dxa"/>
+              <w:start w:w="90" w:type="dxa"/>
+              <w:bottom w:w="90" w:type="dxa"/>
+              <w:end w:w="90" w:type="dxa"/>
+            </w:tcMar>
+            <w:vAlign w:val="center"/>
+          </w:tcPr>
+          <w:p>
+            <w:r>
+              <w:t>6+ synthetic/manual participants stable.</w:t>
+            </w:r>
+          </w:p>
+        </w:tc>
+      </w:tr>
+      <w:tr>
+        <w:tc>
+          <w:tcPr>
+            <w:tcW w:type="dxa" w:w="3389"/>
+            <w:tcMar>
+              <w:top w:w="90" w:type="dxa"/>
+              <w:start w:w="90" w:type="dxa"/>
+              <w:bottom w:w="90" w:type="dxa"/>
+              <w:end w:w="90" w:type="dxa"/>
+            </w:tcMar>
+            <w:vAlign w:val="center"/>
+            <w:shd w:fill="F5F8FC"/>
+          </w:tcPr>
+          <w:p>
+            <w:r>
+              <w:t>5. Realtime protocol</w:t>
+            </w:r>
+          </w:p>
+        </w:tc>
+        <w:tc>
+          <w:tcPr>
+            <w:tcW w:type="dxa" w:w="3389"/>
+            <w:tcMar>
+              <w:top w:w="90" w:type="dxa"/>
+              <w:start w:w="90" w:type="dxa"/>
+              <w:bottom w:w="90" w:type="dxa"/>
+              <w:end w:w="90" w:type="dxa"/>
+            </w:tcMar>
+            <w:vAlign w:val="center"/>
+            <w:shd w:fill="F5F8FC"/>
+          </w:tcPr>
+          <w:p>
+            <w:r>
+              <w:t>Versioned room events, server snapshots, reconnect/resync.</w:t>
+            </w:r>
+          </w:p>
+        </w:tc>
+        <w:tc>
+          <w:tcPr>
+            <w:tcW w:type="dxa" w:w="3389"/>
+            <w:tcMar>
+              <w:top w:w="90" w:type="dxa"/>
+              <w:start w:w="90" w:type="dxa"/>
+              <w:bottom w:w="90" w:type="dxa"/>
+              <w:end w:w="90" w:type="dxa"/>
+            </w:tcMar>
+            <w:vAlign w:val="center"/>
+            <w:shd w:fill="F5F8FC"/>
+          </w:tcPr>
+          <w:p>
+            <w:r>
+              <w:t>Stale, duplicate and reconnect tests pass.</w:t>
+            </w:r>
+          </w:p>
+        </w:tc>
+      </w:tr>
+      <w:tr>
+        <w:tc>
+          <w:tcPr>
+            <w:tcW w:type="dxa" w:w="3389"/>
+            <w:tcMar>
+              <w:top w:w="90" w:type="dxa"/>
+              <w:start w:w="90" w:type="dxa"/>
+              <w:bottom w:w="90" w:type="dxa"/>
+              <w:end w:w="90" w:type="dxa"/>
+            </w:tcMar>
+            <w:vAlign w:val="center"/>
+          </w:tcPr>
+          <w:p>
+            <w:r>
+              <w:t>6. Card core</w:t>
             </w:r>
           </w:p>
         </w:tc>
@@ -2892,7 +3006,7 @@
           </w:tcPr>
           <w:p>
             <w:r>
-              <w:t>5. Teen Patti</w:t>
+              <w:t>7. Teen Patti</w:t>
             </w:r>
           </w:p>
         </w:tc>
@@ -2910,7 +3024,7 @@
           </w:tcPr>
           <w:p>
             <w:r>
-              <w:t>Classic rules, boot, blind/seen, chaal, raise, pack, side show, show, settlement.</w:t>
+              <w:t>Classic rules per DECISIONS.md section B, ledger-backed settlement.</w:t>
             </w:r>
           </w:p>
         </w:tc>
@@ -2947,7 +3061,7 @@
           </w:tcPr>
           <w:p>
             <w:r>
-              <w:t>6. Poker</w:t>
+              <w:t>8. Poker</w:t>
             </w:r>
           </w:p>
         </w:tc>
@@ -2964,7 +3078,7 @@
           </w:tcPr>
           <w:p>
             <w:r>
-              <w:t>Texas Hold'em, blinds, streets, check/call/bet/raise/fold/all in, side pots, showdown.</w:t>
+              <w:t>Texas Hold'em, blinds, streets, all in, side pots, showdown.</w:t>
             </w:r>
           </w:p>
         </w:tc>
@@ -3001,7 +3115,7 @@
           </w:tcPr>
           <w:p>
             <w:r>
-              <w:t>7. Economy + DB</w:t>
+              <w:t>9. Banker</w:t>
             </w:r>
           </w:p>
         </w:tc>
@@ -3019,7 +3133,7 @@
           </w:tcPr>
           <w:p>
             <w:r>
-              <w:t>Accounts, immutable ledger, pot transactions, migrations, history.</w:t>
+              <w:t>Borrow, partial/full repayment, limits, reserve, scripted comments.</w:t>
             </w:r>
           </w:p>
         </w:tc>
@@ -3034,59 +3148,6 @@
             </w:tcMar>
             <w:vAlign w:val="center"/>
             <w:shd w:fill="F5F8FC"/>
-          </w:tcPr>
-          <w:p>
-            <w:r>
-              <w:t>Chip conservation and concurrency tests pass.</w:t>
-            </w:r>
-          </w:p>
-        </w:tc>
-      </w:tr>
-      <w:tr>
-        <w:tc>
-          <w:tcPr>
-            <w:tcW w:type="dxa" w:w="3389"/>
-            <w:tcMar>
-              <w:top w:w="90" w:type="dxa"/>
-              <w:start w:w="90" w:type="dxa"/>
-              <w:bottom w:w="90" w:type="dxa"/>
-              <w:end w:w="90" w:type="dxa"/>
-            </w:tcMar>
-            <w:vAlign w:val="center"/>
-          </w:tcPr>
-          <w:p>
-            <w:r>
-              <w:t>8. Banker</w:t>
-            </w:r>
-          </w:p>
-        </w:tc>
-        <w:tc>
-          <w:tcPr>
-            <w:tcW w:type="dxa" w:w="3389"/>
-            <w:tcMar>
-              <w:top w:w="90" w:type="dxa"/>
-              <w:start w:w="90" w:type="dxa"/>
-              <w:bottom w:w="90" w:type="dxa"/>
-              <w:end w:w="90" w:type="dxa"/>
-            </w:tcMar>
-            <w:vAlign w:val="center"/>
-          </w:tcPr>
-          <w:p>
-            <w:r>
-              <w:t>Borrow, partial/full repayment, limits, reserve, scripted comments.</w:t>
-            </w:r>
-          </w:p>
-        </w:tc>
-        <w:tc>
-          <w:tcPr>
-            <w:tcW w:type="dxa" w:w="3389"/>
-            <w:tcMar>
-              <w:top w:w="90" w:type="dxa"/>
-              <w:start w:w="90" w:type="dxa"/>
-              <w:bottom w:w="90" w:type="dxa"/>
-              <w:end w:w="90" w:type="dxa"/>
-            </w:tcMar>
-            <w:vAlign w:val="center"/>
           </w:tcPr>
           <w:p>
             <w:r>
@@ -3106,11 +3167,10 @@
               <w:end w:w="90" w:type="dxa"/>
             </w:tcMar>
             <w:vAlign w:val="center"/>
-            <w:shd w:fill="F5F8FC"/>
           </w:tcPr>
           <w:p>
             <w:r>
-              <w:t>9. Social money</w:t>
+              <w:t>10. Social lending</w:t>
             </w:r>
           </w:p>
         </w:tc>
@@ -3124,11 +3184,10 @@
               <w:end w:w="90" w:type="dxa"/>
             </w:tcMar>
             <w:vAlign w:val="center"/>
-            <w:shd w:fill="F5F8FC"/>
           </w:tcPr>
           <w:p>
             <w:r>
-              <w:t>Gift, loan, request, partial repayment, debt UI.</w:t>
+              <w:t>Gift, loan, request, partial repayment, debt UI, mid-hand transfer lock.</w:t>
             </w:r>
           </w:p>
         </w:tc>
@@ -3142,7 +3201,6 @@
               <w:end w:w="90" w:type="dxa"/>
             </w:tcMar>
             <w:vAlign w:val="center"/>
-            <w:shd w:fill="F5F8FC"/>
           </w:tcPr>
           <w:p>
             <w:r>
@@ -3162,10 +3220,11 @@
               <w:end w:w="90" w:type="dxa"/>
             </w:tcMar>
             <w:vAlign w:val="center"/>
+            <w:shd w:fill="F5F8FC"/>
           </w:tcPr>
           <w:p>
             <w:r>
-              <w:t>10. Variations</w:t>
+              <w:t>11. Variations</w:t>
             </w:r>
           </w:p>
         </w:tc>
@@ -3179,6 +3238,7 @@
               <w:end w:w="90" w:type="dxa"/>
             </w:tcMar>
             <w:vAlign w:val="center"/>
+            <w:shd w:fill="F5F8FC"/>
           </w:tcPr>
           <w:p>
             <w:r>
@@ -3196,6 +3256,7 @@
               <w:end w:w="90" w:type="dxa"/>
             </w:tcMar>
             <w:vAlign w:val="center"/>
+            <w:shd w:fill="F5F8FC"/>
           </w:tcPr>
           <w:p>
             <w:r>
@@ -3215,11 +3276,10 @@
               <w:end w:w="90" w:type="dxa"/>
             </w:tcMar>
             <w:vAlign w:val="center"/>
-            <w:shd w:fill="F5F8FC"/>
           </w:tcPr>
           <w:p>
             <w:r>
-              <w:t>11. Hardening</w:t>
+              <w:t>12. Polish + Hardening</w:t>
             </w:r>
           </w:p>
         </w:tc>
@@ -3233,11 +3293,10 @@
               <w:end w:w="90" w:type="dxa"/>
             </w:tcMar>
             <w:vAlign w:val="center"/>
-            <w:shd w:fill="F5F8FC"/>
           </w:tcPr>
           <w:p>
             <w:r>
-              <w:t>Timeouts, host migration, abuse controls, reconnect, rate limits, accessibility, performance.</w:t>
+              <w:t>Audio, motion, timeouts, host migration, abuse controls, rate limits, accessibility, performance.</w:t>
             </w:r>
           </w:p>
         </w:tc>
@@ -3251,7 +3310,6 @@
               <w:end w:w="90" w:type="dxa"/>
             </w:tcMar>
             <w:vAlign w:val="center"/>
-            <w:shd w:fill="F5F8FC"/>
           </w:tcPr>
           <w:p>
             <w:r>
@@ -3274,7 +3332,7 @@
           </w:tcPr>
           <w:p>
             <w:r>
-              <w:t>12. Production release</w:t>
+              <w:t>13. Production release</w:t>
             </w:r>
           </w:p>
         </w:tc>
@@ -4385,7 +4443,7 @@
     </w:p>
     <w:p>
       <w:r>
-        <w:t>For Codex, use a project level design skill rather than relying on a prompt every time. A strong current option is UX/UI Design Taste, which explicitly supports Codex and includes accessibility, component taste, content realism, motion, polish and frontend guardrails. Anthropic's frontend-design skill is also a useful reference for distinctive, intentional UI. The project's own rules remain authoritative.</w:t>
+        <w:t>Prefer a project level design reference over repeating a prompt. The project's own rules remain authoritative; no third party skill is required.</w:t>
       </w:r>
     </w:p>
     <w:p>

</xml_diff>